<commit_message>
Cover letter, title page and point-by-point response to the 20 internal reviews
Co-Authored-By: Claude Opus 5.5 <noreply@anthropic.com>
Claude-Session: https://claude.ai/code/session_015S4667fLxo6aga9FDstjDx
</commit_message>
<xml_diff>
--- a/docs/paper/cover_letter.docx
+++ b/docs/paper/cover_letter.docx
@@ -58,7 +58,7 @@
           <w:bCs/>
           <w:b/>
         </w:rPr>
-        <w:t xml:space="preserve">Certified Coverage Planning under Execution Uncertainty: Conformal Erosion with Theory-Pivoted Calibration for Agricultural Field Operations</w:t>
+        <w:t xml:space="preserve">Certified Coverage Planning under Execution Uncertainty: Conformal Erosion with Model-Pivoted Cross-Field Calibration for Agricultural Field Operations</w:t>
       </w:r>
       <w:r>
         <w:rPr>
@@ -102,7 +102,7 @@
         <w:t xml:space="preserve"> </w:t>
       </w:r>
       <w:r>
-        <w:t xml:space="preserve">Coverage path planners for field operations assume exact execution. In practice, GNSS error, wheel slip and controller dynamics make adjacent passes drift apart and leave unworked strips. Farmers and vendors respond with a fixed overlap, but no stated probability of complete coverage comes with it, and the overlap needed varies strongly between fields, terrains, GNSS grades and implements.</w:t>
+        <w:t xml:space="preserve">Coverage path planners assume exact execution. In practice, GNSS error, wheel slip and controller dynamics make adjacent passes drift apart and leave unworked strips. Practice responds with a fixed overlap that carries no stated reliability, and the overlap needed varies between fields, terrains, GNSS grades and implements.</w:t>
       </w:r>
     </w:p>
     <w:p>
@@ -130,13 +130,13 @@
           <w:bCs/>
           <w:b/>
         </w:rPr>
-        <w:t xml:space="preserve">An exact reduction.</w:t>
+        <w:t xml:space="preserve">An exact score.</w:t>
       </w:r>
       <w:r>
         <w:t xml:space="preserve"> </w:t>
       </w:r>
       <w:r>
-        <w:t xml:space="preserve">The zero-miss event of a coverage plan is reduced to a scalar run score (the covering radius of the executed passes). We prove that this is the smallest score that yields valid certificates.</w:t>
+        <w:t xml:space="preserve">Complete coverage of a field by an executed plan is equivalent to one number per run, the covering radius of the executed passes, and this is the smallest score that can certify it.</w:t>
       </w:r>
     </w:p>
     <w:p>
@@ -152,13 +152,13 @@
           <w:bCs/>
           <w:b/>
         </w:rPr>
-        <w:t xml:space="preserve">Distribution-free certificates.</w:t>
+        <w:t xml:space="preserve">Certified margins with field history.</w:t>
       </w:r>
       <w:r>
         <w:t xml:space="preserve"> </w:t>
       </w:r>
       <w:r>
-        <w:t xml:space="preserve">Conformal erosion calibrates the footprint margin from logged runs and gives finite-sample, distribution-free guarantees of miss-free operation. A coupling inequality bounds the effect of re-planning.</w:t>
+        <w:t xml:space="preserve">Conformal calibration of this score gives a miss probability that is assumption-free for the calibrated plan and transfers to plans with fewer passes under an explicit, stated assumption.</w:t>
       </w:r>
     </w:p>
     <w:p>
@@ -174,13 +174,13 @@
           <w:bCs/>
           <w:b/>
         </w:rPr>
-        <w:t xml:space="preserve">Certification without field history.</w:t>
+        <w:t xml:space="preserve">Certified margins without field history.</w:t>
       </w:r>
       <w:r>
         <w:t xml:space="preserve"> </w:t>
       </w:r>
       <w:r>
-        <w:t xml:space="preserve">A five-layer extreme-value theory of execution error predicts each field’s required margin from controller, terrain and GNSS statistics alone. Used as a pivot for cross-field conformal calibration, it certifies fields that have never been worked. The method takes 0.3–6 min per field on one CPU core.</w:t>
+        <w:t xml:space="preserve">A model of vehicle, terrain and GNSS (analytic or a Monte Carlo twin) puts fields on a common scale for cross-field calibration; the guarantee does not depend on the model’s accuracy.</w:t>
       </w:r>
     </w:p>
     <w:p>
@@ -196,13 +196,13 @@
           <w:bCs/>
           <w:b/>
         </w:rPr>
-        <w:t xml:space="preserve">Evaluation.</w:t>
+        <w:t xml:space="preserve">A transparent simulation study.</w:t>
       </w:r>
       <w:r>
         <w:t xml:space="preserve"> </w:t>
       </w:r>
       <w:r>
-        <w:t xml:space="preserve">The evaluation uses real field boundaries, elevation models and multi-station GNSS error series, under three machine configurations. A pre-registered comparison on 90 fresh fields met every validity and efficiency claim: 4.0–54.7% less overlap than two recent conformal planners at the same guarantee level. A pre-registered resampling check confirmed the coverage guarantee in all 26 cells.</w:t>
+        <w:t xml:space="preserve">All confirmatory experiments were pre-registered in a time-stamped repository. The study reports where the method helps (tighter than two conformal planners at the same guarantee; the only efficient scale across a mixed machine fleet), where it does not (within one configuration; under heavy-tailed slip or unstable steering the model loses its advantage), and when a zero-miss certificate is worth its overlap at all (only when a missed area costs about 30–100 times an over-applied one).</w:t>
       </w:r>
     </w:p>
     <w:p>
@@ -220,7 +220,7 @@
         <w:t xml:space="preserve"> </w:t>
       </w:r>
       <w:r>
-        <w:t xml:space="preserve">The work turns a routine agronomic decision, how much to overlap, into a certified, computable quantity. It can be used directly with standard guidance hardware, auto-steer logs and public terrain data. It also connects agricultural guidance with current methods in conformal prediction and extreme-value theory.</w:t>
+        <w:t xml:space="preserve">The work turns a routine decision, how much overlap to plan, into a quantity with a stated reliability, and shows what that reliability costs in agronomic terms. It works with standard guidance hardware and public terrain data, and its limits, including the need for independent ground truth in calibration runs, are stated explicitly.</w:t>
       </w:r>
     </w:p>
     <w:p>
@@ -232,13 +232,13 @@
           <w:bCs/>
           <w:b/>
         </w:rPr>
-        <w:t xml:space="preserve">Transparency.</w:t>
+        <w:t xml:space="preserve">Status of the evidence.</w:t>
       </w:r>
       <w:r>
         <w:t xml:space="preserve"> </w:t>
       </w:r>
       <w:r>
-        <w:t xml:space="preserve">Every confirmatory experiment was pre-registered in a timestamped repository before it was run. All registered outcomes, including one zero-data experiment that failed and the cells in which no method can improve (an information limit we derive and predict), are reported in full. Code, data-processing scripts, pre-registrations and raw results will be made openly available upon publication.</w:t>
+        <w:t xml:space="preserve">All results are from simulation driven by real field boundaries, elevation models and GNSS error series; this is stated in the abstract, the graphical abstract and the limitations. Every registered outcome is reported, including failed and partially met claims. Code, processed data, pre-registrations and raw results will be openly available with a DOI upon publication.</w:t>
       </w:r>
     </w:p>
     <w:p>
@@ -247,14 +247,6 @@
       </w:pPr>
       <w:r>
         <w:t xml:space="preserve">This manuscript has not been published and is not under consideration elsewhere. All authors have approved the submission and declare no competing interests.</w:t>
-      </w:r>
-    </w:p>
-    <w:p>
-      <w:pPr>
-        <w:pStyle w:val="BodyText"/>
-      </w:pPr>
-      <w:r>
-        <w:t xml:space="preserve">Thank you for considering our work.</w:t>
       </w:r>
     </w:p>
     <w:p>

</xml_diff>

<commit_message>
B5/C1 resampled with field-edge terms on all 45 R3 fields; Tables 6-7, Fig. 4, graphical abstract and supplementary updated; black Word styles
- rev_resample.py: RV_SUFFIX writes the rerun to *_edges45.txt; first run kept
- Only the theory+edges rows change. Table 6 gains an XCE-T-with-edges row
  (DGPS coverage 0.899-0.924 instead of 0.834-0.904, same excess); Table 7 values
  and C1 text updated; registered C1 prediction outcomes unchanged
- reference.docx with black Times styles; Word files rebuilt; stale pandoc PDF previews removed
- README: map updated to the LaTeX build and the edges45 outputs

Co-Authored-By: Claude Opus 5.5 <noreply@anthropic.com>
Claude-Session: https://claude.ai/code/session_015S4667fLxo6aga9FDstjDx
</commit_message>
<xml_diff>
--- a/docs/paper/cover_letter.docx
+++ b/docs/paper/cover_letter.docx
@@ -525,6 +525,11 @@
   <w:style w:default="1" w:styleId="Normal" w:type="paragraph">
     <w:name w:val="Normal"/>
     <w:qFormat/>
+    <w:rPr>
+      <w:rFonts w:ascii="Times New Roman" w:cs="Times New Roman" w:eastAsia="Times New Roman" w:hAnsi="Times New Roman"/>
+      <w:color w:val="000000"/>
+      <w:sz w:val="24"/>
+    </w:rPr>
   </w:style>
   <w:style w:styleId="BodyText" w:type="paragraph">
     <w:name w:val="Body Text"/>
@@ -534,12 +539,22 @@
       <w:spacing w:after="180" w:before="180"/>
     </w:pPr>
     <w:qFormat/>
+    <w:rPr>
+      <w:rFonts w:ascii="Times New Roman" w:cs="Times New Roman" w:eastAsia="Times New Roman" w:hAnsi="Times New Roman"/>
+      <w:color w:val="000000"/>
+      <w:sz w:val="24"/>
+    </w:rPr>
   </w:style>
   <w:style w:customStyle="1" w:styleId="FirstParagraph" w:type="paragraph">
     <w:name w:val="First Paragraph"/>
     <w:basedOn w:val="BodyText"/>
     <w:next w:val="BodyText"/>
     <w:qFormat/>
+    <w:rPr>
+      <w:rFonts w:ascii="Times New Roman" w:cs="Times New Roman" w:eastAsia="Times New Roman" w:hAnsi="Times New Roman"/>
+      <w:color w:val="000000"/>
+      <w:sz w:val="24"/>
+    </w:rPr>
   </w:style>
   <w:style w:customStyle="1" w:styleId="Compact" w:type="paragraph">
     <w:name w:val="Compact"/>
@@ -548,6 +563,11 @@
     <w:pPr>
       <w:spacing w:after="36" w:before="36"/>
     </w:pPr>
+    <w:rPr>
+      <w:rFonts w:ascii="Times New Roman" w:cs="Times New Roman" w:eastAsia="Times New Roman" w:hAnsi="Times New Roman"/>
+      <w:color w:val="000000"/>
+      <w:sz w:val="24"/>
+    </w:rPr>
   </w:style>
   <w:style w:styleId="Title" w:type="paragraph">
     <w:name w:val="Title"/>
@@ -561,11 +581,12 @@
       <w:jc w:val="center"/>
     </w:pPr>
     <w:rPr>
-      <w:rFonts w:asciiTheme="majorHAnsi" w:cstheme="majorBidi" w:eastAsiaTheme="majorEastAsia" w:hAnsiTheme="majorHAnsi"/>
+      <w:rFonts w:ascii="Times New Roman" w:cs="Times New Roman" w:eastAsia="Times New Roman" w:hAnsi="Times New Roman"/>
       <w:b/>
       <w:bCs/>
-      <w:color w:themeColor="accent1" w:themeShade="B5" w:val="345A8A"/>
-      <w:sz w:val="36"/>
+      <w:i w:val="0"/>
+      <w:color w:val="000000"/>
+      <w:sz w:val="32"/>
       <w:szCs w:val="36"/>
     </w:rPr>
   </w:style>
@@ -581,7 +602,11 @@
       <w:jc w:val="center"/>
     </w:pPr>
     <w:rPr>
-      <w:sz w:val="30"/>
+      <w:rFonts w:ascii="Times New Roman" w:cs="Times New Roman" w:eastAsia="Times New Roman" w:hAnsi="Times New Roman"/>
+      <w:b/>
+      <w:i w:val="0"/>
+      <w:color w:val="000000"/>
+      <w:sz w:val="24"/>
       <w:szCs w:val="30"/>
     </w:rPr>
   </w:style>
@@ -594,6 +619,10 @@
       <w:keepLines/>
       <w:jc w:val="center"/>
     </w:pPr>
+    <w:rPr>
+      <w:rFonts w:ascii="Times New Roman" w:cs="Times New Roman" w:eastAsia="Times New Roman" w:hAnsi="Times New Roman"/>
+      <w:color w:val="000000"/>
+    </w:rPr>
   </w:style>
   <w:style w:styleId="Date" w:type="paragraph">
     <w:name w:val="Date"/>
@@ -604,6 +633,10 @@
       <w:keepLines/>
       <w:jc w:val="center"/>
     </w:pPr>
+    <w:rPr>
+      <w:rFonts w:ascii="Times New Roman" w:cs="Times New Roman" w:eastAsia="Times New Roman" w:hAnsi="Times New Roman"/>
+      <w:color w:val="000000"/>
+    </w:rPr>
   </w:style>
   <w:style w:customStyle="1" w:styleId="AbstractTitle" w:type="paragraph">
     <w:name w:val="Abstract Title"/>
@@ -617,11 +650,11 @@
       <w:spacing w:after="0" w:before="300"/>
     </w:pPr>
     <w:rPr>
+      <w:color w:val="000000"/>
       <w:sz w:val="20"/>
       <w:szCs w:val="20"/>
-      <w:b/>
-      <w:color w:val="345A8A"/>
-      &gt;
+      <w:rFonts w:ascii="Times New Roman" w:cs="Times New Roman" w:eastAsia="Times New Roman" w:hAnsi="Times New Roman"/>
+      <w:b/>
     </w:rPr>
   </w:style>
   <w:style w:customStyle="1" w:styleId="Abstract" w:type="paragraph">
@@ -635,7 +668,9 @@
       <w:spacing w:after="300" w:before="100"/>
     </w:pPr>
     <w:rPr>
-      <w:sz w:val="20"/>
+      <w:rFonts w:ascii="Times New Roman" w:cs="Times New Roman" w:eastAsia="Times New Roman" w:hAnsi="Times New Roman"/>
+      <w:color w:val="000000"/>
+      <w:sz w:val="24"/>
       <w:szCs w:val="20"/>
     </w:rPr>
   </w:style>
@@ -645,7 +680,10 @@
     <w:next w:val="Bibliography"/>
     <w:qFormat/>
     <w:pPr/>
-    <w:rPr/>
+    <w:rPr>
+      <w:rFonts w:ascii="Times New Roman" w:cs="Times New Roman" w:eastAsia="Times New Roman" w:hAnsi="Times New Roman"/>
+      <w:color w:val="000000"/>
+    </w:rPr>
   </w:style>
   <w:style w:styleId="Heading1" w:type="paragraph">
     <w:name w:val="Heading 1"/>
@@ -660,11 +698,12 @@
       <w:outlineLvl w:val="0"/>
     </w:pPr>
     <w:rPr>
-      <w:rFonts w:asciiTheme="majorHAnsi" w:cstheme="majorBidi" w:eastAsiaTheme="majorEastAsia" w:hAnsiTheme="majorHAnsi"/>
+      <w:rFonts w:ascii="Times New Roman" w:cs="Times New Roman" w:eastAsia="Times New Roman" w:hAnsi="Times New Roman"/>
       <w:b/>
       <w:bCs/>
-      <w:color w:themeColor="accent1" w:val="4F81BD"/>
-      <w:sz w:val="32"/>
+      <w:i w:val="0"/>
+      <w:color w:val="000000"/>
+      <w:sz w:val="28"/>
       <w:szCs w:val="32"/>
     </w:rPr>
   </w:style>
@@ -682,11 +721,12 @@
       <w:outlineLvl w:val="1"/>
     </w:pPr>
     <w:rPr>
-      <w:rFonts w:asciiTheme="majorHAnsi" w:cstheme="majorBidi" w:eastAsiaTheme="majorEastAsia" w:hAnsiTheme="majorHAnsi"/>
+      <w:rFonts w:ascii="Times New Roman" w:cs="Times New Roman" w:eastAsia="Times New Roman" w:hAnsi="Times New Roman"/>
       <w:b/>
       <w:bCs/>
-      <w:color w:themeColor="accent1" w:val="4F81BD"/>
-      <w:sz w:val="28"/>
+      <w:i w:val="0"/>
+      <w:color w:val="000000"/>
+      <w:sz w:val="24"/>
       <w:szCs w:val="28"/>
     </w:rPr>
   </w:style>
@@ -704,10 +744,11 @@
       <w:outlineLvl w:val="2"/>
     </w:pPr>
     <w:rPr>
-      <w:rFonts w:asciiTheme="majorHAnsi" w:cstheme="majorBidi" w:eastAsiaTheme="majorEastAsia" w:hAnsiTheme="majorHAnsi"/>
+      <w:rFonts w:ascii="Times New Roman" w:cs="Times New Roman" w:eastAsia="Times New Roman" w:hAnsi="Times New Roman"/>
       <w:b/>
       <w:bCs/>
-      <w:color w:themeColor="accent1" w:val="4F81BD"/>
+      <w:i/>
+      <w:color w:val="000000"/>
       <w:sz w:val="24"/>
       <w:szCs w:val="24"/>
     </w:rPr>
@@ -726,10 +767,11 @@
       <w:outlineLvl w:val="3"/>
     </w:pPr>
     <w:rPr>
-      <w:rFonts w:asciiTheme="majorHAnsi" w:cstheme="majorBidi" w:eastAsiaTheme="majorEastAsia" w:hAnsiTheme="majorHAnsi"/>
+      <w:rFonts w:ascii="Times New Roman" w:cs="Times New Roman" w:eastAsia="Times New Roman" w:hAnsi="Times New Roman"/>
       <w:i/>
+      <w:b/>
       <w:bCs/>
-      <w:color w:themeColor="accent1" w:val="4F81BD"/>
+      <w:color w:val="000000"/>
       <w:sz w:val="24"/>
       <w:szCs w:val="24"/>
     </w:rPr>
@@ -748,9 +790,11 @@
       <w:outlineLvl w:val="4"/>
     </w:pPr>
     <w:rPr>
-      <w:rFonts w:asciiTheme="majorHAnsi" w:cstheme="majorBidi" w:eastAsiaTheme="majorEastAsia" w:hAnsiTheme="majorHAnsi"/>
+      <w:rFonts w:ascii="Times New Roman" w:cs="Times New Roman" w:eastAsia="Times New Roman" w:hAnsi="Times New Roman"/>
+      <w:b/>
+      <w:i w:val="0"/>
       <w:iCs/>
-      <w:color w:themeColor="accent1" w:val="4F81BD"/>
+      <w:color w:val="000000"/>
       <w:sz w:val="24"/>
       <w:szCs w:val="24"/>
     </w:rPr>
@@ -769,8 +813,10 @@
       <w:outlineLvl w:val="5"/>
     </w:pPr>
     <w:rPr>
-      <w:rFonts w:asciiTheme="majorHAnsi" w:cstheme="majorBidi" w:eastAsiaTheme="majorEastAsia" w:hAnsiTheme="majorHAnsi"/>
-      <w:color w:themeColor="accent1" w:val="4F81BD"/>
+      <w:rFonts w:ascii="Times New Roman" w:cs="Times New Roman" w:eastAsia="Times New Roman" w:hAnsi="Times New Roman"/>
+      <w:b/>
+      <w:i w:val="0"/>
+      <w:color w:val="000000"/>
       <w:sz w:val="24"/>
       <w:szCs w:val="24"/>
     </w:rPr>
@@ -789,8 +835,8 @@
       <w:outlineLvl w:val="6"/>
     </w:pPr>
     <w:rPr>
-      <w:rFonts w:asciiTheme="majorHAnsi" w:cstheme="majorBidi" w:eastAsiaTheme="majorEastAsia" w:hAnsiTheme="majorHAnsi"/>
-      <w:color w:themeColor="accent1" w:val="4F81BD"/>
+      <w:rFonts w:ascii="Times New Roman" w:cs="Times New Roman" w:eastAsia="Times New Roman" w:hAnsi="Times New Roman"/>
+      <w:color w:val="000000"/>
       <w:sz w:val="24"/>
       <w:szCs w:val="24"/>
     </w:rPr>
@@ -809,8 +855,8 @@
       <w:outlineLvl w:val="7"/>
     </w:pPr>
     <w:rPr>
-      <w:rFonts w:asciiTheme="majorHAnsi" w:cstheme="majorBidi" w:eastAsiaTheme="majorEastAsia" w:hAnsiTheme="majorHAnsi"/>
-      <w:color w:themeColor="accent1" w:val="4F81BD"/>
+      <w:rFonts w:ascii="Times New Roman" w:cs="Times New Roman" w:eastAsia="Times New Roman" w:hAnsi="Times New Roman"/>
+      <w:color w:val="000000"/>
       <w:sz w:val="24"/>
       <w:szCs w:val="24"/>
     </w:rPr>
@@ -829,8 +875,8 @@
       <w:outlineLvl w:val="8"/>
     </w:pPr>
     <w:rPr>
-      <w:rFonts w:asciiTheme="majorHAnsi" w:cstheme="majorBidi" w:eastAsiaTheme="majorEastAsia" w:hAnsiTheme="majorHAnsi"/>
-      <w:color w:themeColor="accent1" w:val="4F81BD"/>
+      <w:rFonts w:ascii="Times New Roman" w:cs="Times New Roman" w:eastAsia="Times New Roman" w:hAnsi="Times New Roman"/>
+      <w:color w:val="000000"/>
       <w:sz w:val="24"/>
       <w:szCs w:val="24"/>
     </w:rPr>
@@ -846,6 +892,11 @@
       <w:spacing w:after="100" w:before="100"/>
       <w:ind w:firstLine="0" w:left="480" w:right="480"/>
     </w:pPr>
+    <w:rPr>
+      <w:rFonts w:ascii="Times New Roman" w:cs="Times New Roman" w:eastAsia="Times New Roman" w:hAnsi="Times New Roman"/>
+      <w:color w:val="000000"/>
+      <w:sz w:val="24"/>
+    </w:rPr>
   </w:style>
   <w:style w:styleId="FootnoteText" w:type="paragraph">
     <w:name w:val="Footnote Text"/>
@@ -854,11 +905,19 @@
     <w:uiPriority w:val="9"/>
     <w:unhideWhenUsed/>
     <w:qFormat/>
+    <w:rPr>
+      <w:rFonts w:ascii="Times New Roman" w:cs="Times New Roman" w:eastAsia="Times New Roman" w:hAnsi="Times New Roman"/>
+      <w:color w:val="000000"/>
+    </w:rPr>
   </w:style>
   <w:style w:default="1" w:styleId="DefaultParagraphFont" w:type="character">
     <w:name w:val="Default Paragraph Font"/>
     <w:semiHidden/>
     <w:unhideWhenUsed/>
+    <w:rPr>
+      <w:rFonts w:ascii="Times New Roman" w:cs="Times New Roman" w:eastAsia="Times New Roman" w:hAnsi="Times New Roman"/>
+      <w:color w:val="000000"/>
+    </w:rPr>
   </w:style>
   <w:style w:default="1" w:styleId="Table" w:type="table">
     <w:name w:val="Table"/>
@@ -866,6 +925,10 @@
     <w:semiHidden/>
     <w:unhideWhenUsed/>
     <w:qFormat/>
+    <w:rPr>
+      <w:rFonts w:ascii="Times New Roman" w:cs="Times New Roman" w:eastAsia="Times New Roman" w:hAnsi="Times New Roman"/>
+      <w:color w:val="000000"/>
+    </w:rPr>
     <w:tblPr>
       <w:tblInd w:type="dxa" w:w="0"/>
       <w:tblCellMar>
@@ -901,12 +964,18 @@
       <w:spacing w:after="0"/>
     </w:pPr>
     <w:rPr>
-      <w:b/>
+      <w:rFonts w:ascii="Times New Roman" w:cs="Times New Roman" w:eastAsia="Times New Roman" w:hAnsi="Times New Roman"/>
+      <w:b/>
+      <w:color w:val="000000"/>
     </w:rPr>
   </w:style>
   <w:style w:customStyle="1" w:styleId="Definition" w:type="paragraph">
     <w:name w:val="Definition"/>
     <w:basedOn w:val="Normal"/>
+    <w:rPr>
+      <w:rFonts w:ascii="Times New Roman" w:cs="Times New Roman" w:eastAsia="Times New Roman" w:hAnsi="Times New Roman"/>
+      <w:color w:val="000000"/>
+    </w:rPr>
   </w:style>
   <w:style w:styleId="Caption" w:type="paragraph">
     <w:name w:val="Caption"/>
@@ -916,7 +985,10 @@
       <w:spacing w:after="120" w:before="0"/>
     </w:pPr>
     <w:rPr>
-      <w:i/>
+      <w:rFonts w:ascii="Times New Roman" w:cs="Times New Roman" w:eastAsia="Times New Roman" w:hAnsi="Times New Roman"/>
+      <w:i w:val="0"/>
+      <w:color w:val="000000"/>
+      <w:sz w:val="20"/>
     </w:rPr>
   </w:style>
   <w:style w:customStyle="1" w:styleId="TableCaption" w:type="paragraph">
@@ -925,14 +997,30 @@
     <w:pPr>
       <w:keepNext/>
     </w:pPr>
+    <w:rPr>
+      <w:rFonts w:ascii="Times New Roman" w:cs="Times New Roman" w:eastAsia="Times New Roman" w:hAnsi="Times New Roman"/>
+      <w:i w:val="0"/>
+      <w:color w:val="000000"/>
+      <w:sz w:val="20"/>
+    </w:rPr>
   </w:style>
   <w:style w:customStyle="1" w:styleId="ImageCaption" w:type="paragraph">
     <w:name w:val="Image Caption"/>
     <w:basedOn w:val="Caption"/>
+    <w:rPr>
+      <w:rFonts w:ascii="Times New Roman" w:cs="Times New Roman" w:eastAsia="Times New Roman" w:hAnsi="Times New Roman"/>
+      <w:i w:val="0"/>
+      <w:color w:val="000000"/>
+      <w:sz w:val="20"/>
+    </w:rPr>
   </w:style>
   <w:style w:customStyle="1" w:styleId="Figure" w:type="paragraph">
     <w:name w:val="Figure"/>
     <w:basedOn w:val="Normal"/>
+    <w:rPr>
+      <w:rFonts w:ascii="Times New Roman" w:cs="Times New Roman" w:eastAsia="Times New Roman" w:hAnsi="Times New Roman"/>
+      <w:color w:val="000000"/>
+    </w:rPr>
   </w:style>
   <w:style w:customStyle="1" w:styleId="CaptionedFigure" w:type="paragraph">
     <w:name w:val="Captioned Figure"/>
@@ -940,28 +1028,43 @@
     <w:pPr>
       <w:keepNext/>
     </w:pPr>
+    <w:rPr>
+      <w:rFonts w:ascii="Times New Roman" w:cs="Times New Roman" w:eastAsia="Times New Roman" w:hAnsi="Times New Roman"/>
+      <w:color w:val="000000"/>
+    </w:rPr>
   </w:style>
   <w:style w:customStyle="1" w:styleId="BodyTextChar" w:type="character">
     <w:name w:val="Body Text Char"/>
     <w:basedOn w:val="DefaultParagraphFont"/>
     <w:link w:val="BodyText"/>
+    <w:rPr>
+      <w:rFonts w:ascii="Times New Roman" w:cs="Times New Roman" w:eastAsia="Times New Roman" w:hAnsi="Times New Roman"/>
+      <w:color w:val="000000"/>
+    </w:rPr>
   </w:style>
   <w:style w:customStyle="1" w:styleId="VerbatimChar" w:type="character">
     <w:name w:val="Verbatim Char"/>
     <w:basedOn w:val="BodyTextChar"/>
     <w:rPr>
-      <w:rFonts w:ascii="Consolas" w:hAnsi="Consolas"/>
+      <w:rFonts w:ascii="Times New Roman" w:cs="Times New Roman" w:eastAsia="Times New Roman" w:hAnsi="Times New Roman"/>
+      <w:color w:val="000000"/>
       <w:sz w:val="22"/>
     </w:rPr>
   </w:style>
   <w:style w:customStyle="1" w:styleId="SectionNumber" w:type="character">
     <w:name w:val="Section Number"/>
     <w:basedOn w:val="BodyTextChar"/>
+    <w:rPr>
+      <w:rFonts w:ascii="Times New Roman" w:cs="Times New Roman" w:eastAsia="Times New Roman" w:hAnsi="Times New Roman"/>
+      <w:color w:val="000000"/>
+    </w:rPr>
   </w:style>
   <w:style w:styleId="FootnoteReference" w:type="character">
     <w:name w:val="Footnote Reference"/>
     <w:basedOn w:val="BodyTextChar"/>
     <w:rPr>
+      <w:rFonts w:ascii="Times New Roman" w:cs="Times New Roman" w:eastAsia="Times New Roman" w:hAnsi="Times New Roman"/>
+      <w:color w:val="000000"/>
       <w:vertAlign w:val="superscript"/>
     </w:rPr>
   </w:style>
@@ -969,7 +1072,8 @@
     <w:name w:val="Hyperlink"/>
     <w:basedOn w:val="BodyTextChar"/>
     <w:rPr>
-      <w:color w:themeColor="accent1" w:val="4F81BD"/>
+      <w:rFonts w:ascii="Times New Roman" w:cs="Times New Roman" w:eastAsia="Times New Roman" w:hAnsi="Times New Roman"/>
+      <w:color w:val="000000"/>
     </w:rPr>
   </w:style>
   <w:style w:styleId="TOCHeading" w:type="paragraph">
@@ -984,10 +1088,10 @@
       <w:outlineLvl w:val="9"/>
     </w:pPr>
     <w:rPr>
-      <w:rFonts w:asciiTheme="majorHAnsi" w:cstheme="majorBidi" w:eastAsiaTheme="majorEastAsia" w:hAnsiTheme="majorHAnsi"/>
+      <w:rFonts w:ascii="Times New Roman" w:cs="Times New Roman" w:eastAsia="Times New Roman" w:hAnsi="Times New Roman"/>
       <w:b w:val="0"/>
       <w:bCs w:val="0"/>
-      <w:color w:themeColor="accent1" w:themeShade="BF" w:val="365F91"/>
+      <w:color w:val="000000"/>
     </w:rPr>
   </w:style>
   <w:style w:type="paragraph" w:customStyle="1" w:styleId="SourceCode">

</xml_diff>

<commit_message>
Cover letter, title page and README follow the new title and storyline; Chinese glossary round-2 additions
Co-Authored-By: Claude Opus 5.5 <noreply@anthropic.com>
Claude-Session: https://claude.ai/code/session_015S4667fLxo6aga9FDstjDx
</commit_message>
<xml_diff>
--- a/docs/paper/cover_letter.docx
+++ b/docs/paper/cover_letter.docx
@@ -58,7 +58,7 @@
           <w:bCs/>
           <w:b/>
         </w:rPr>
-        <w:t xml:space="preserve">Certified Coverage Planning under Execution Uncertainty: Conformal Erosion with Model-Pivoted Cross-Field Calibration for Agricultural Field Operations</w:t>
+        <w:t xml:space="preserve">Calibrating pass overlap from logged runs to bound the probability of missed strips in agricultural field coverage</w:t>
       </w:r>
       <w:r>
         <w:rPr>
@@ -102,7 +102,7 @@
         <w:t xml:space="preserve"> </w:t>
       </w:r>
       <w:r>
-        <w:t xml:space="preserve">Coverage path planners assume exact execution. In practice, GNSS error, wheel slip and controller dynamics make adjacent passes drift apart and leave unworked strips. Practice responds with a fixed overlap that carries no stated reliability, and the overlap needed varies between fields, terrains, GNSS grades and implements.</w:t>
+        <w:t xml:space="preserve">Guidance systems space parallel passes at the implement width minus an overlap. GNSS error, wheel slip and controller dynamics make adjacent passes drift apart and leave unworked strips, and the fixed overlaps used in practice carry no stated reliability; the overlap needed varies between fields, terrains, GNSS grades and implements.</w:t>
       </w:r>
     </w:p>
     <w:p>
@@ -116,6 +116,12 @@
         </w:rPr>
         <w:t xml:space="preserve">What the paper contributes.</w:t>
       </w:r>
+      <w:r>
+        <w:t xml:space="preserve"> </w:t>
+      </w:r>
+      <w:r>
+        <w:t xml:space="preserve">It proposes conformal erosion, a method that calibrates the overlap margin from logged field operations. The output is a line-spacing setting for the guidance terminal at which the probability of an operation leaving any strip unworked stays below a level chosen by the user; equally, the method states the miss probability of any other margin or gap tolerance.</w:t>
+      </w:r>
     </w:p>
     <w:p>
       <w:pPr>
@@ -130,13 +136,13 @@
           <w:bCs/>
           <w:b/>
         </w:rPr>
-        <w:t xml:space="preserve">An exact score.</w:t>
+        <w:t xml:space="preserve">A coverage score</w:t>
       </w:r>
       <w:r>
         <w:t xml:space="preserve"> </w:t>
       </w:r>
       <w:r>
-        <w:t xml:space="preserve">Complete coverage of a field by an executed plan is equivalent to one number per run, the covering radius of the executed passes, and this is the smallest score that can certify it.</w:t>
+        <w:t xml:space="preserve">reduces each logged operation to one number that decides exactly whether a strip was missed, field edges included, and gives margins no larger than the per-pair scores of earlier conformal planners.</w:t>
       </w:r>
     </w:p>
     <w:p>
@@ -152,13 +158,10 @@
           <w:bCs/>
           <w:b/>
         </w:rPr>
-        <w:t xml:space="preserve">Certified margins with field history.</w:t>
-      </w:r>
-      <w:r>
-        <w:t xml:space="preserve"> </w:t>
-      </w:r>
-      <w:r>
-        <w:t xml:space="preserve">Conformal calibration of this score gives a miss probability that is assumption-free for the calibrated plan and transfers to plans with fewer passes under an explicit, stated assumption.</w:t>
+        <w:t xml:space="preserve">Calibration with field history</w:t>
+      </w:r>
+      <w:r>
+        <w:t xml:space="preserve">: the margin is an order statistic of the scores, with a bound that needs no assumption on the error distribution, only exchangeable operations; a transfer check ensures that the deployed plan has no more passes than the calibrated one.</w:t>
       </w:r>
     </w:p>
     <w:p>
@@ -174,13 +177,10 @@
           <w:bCs/>
           <w:b/>
         </w:rPr>
-        <w:t xml:space="preserve">Certified margins without field history.</w:t>
-      </w:r>
-      <w:r>
-        <w:t xml:space="preserve"> </w:t>
-      </w:r>
-      <w:r>
-        <w:t xml:space="preserve">A model of vehicle, terrain and GNSS (analytic or a Monte Carlo twin) puts fields on a common scale for cross-field calibration; the guarantee does not depend on the model’s accuracy.</w:t>
+        <w:t xml:space="preserve">Calibration without field history</w:t>
+      </w:r>
+      <w:r>
+        <w:t xml:space="preserve">: one logged operation from each of many fields is pooled, scaled by a vehicle–terrain–GNSS model (analytic or a Monte Carlo twin); the model affects efficiency, not the field-averaged bound.</w:t>
       </w:r>
     </w:p>
     <w:p>
@@ -202,7 +202,7 @@
         <w:t xml:space="preserve"> </w:t>
       </w:r>
       <w:r>
-        <w:t xml:space="preserve">All confirmatory experiments were pre-registered in a time-stamped repository. The study reports where the method helps (tighter than two conformal planners at the same guarantee; the only efficient scale across a mixed machine fleet), where it does not (within one configuration; under heavy-tailed slip or unstable steering the model loses its advantage), and when a zero-miss certificate is worth its overlap at all (only when a missed area costs about 30–100 times an over-applied one).</w:t>
+        <w:t xml:space="preserve">All confirmatory experiments were pre-registered. The study reports where the method helps (4–55% less overlap than two conformal planners with field history; 0.6 percentage points above the per-field optimum across a mixed fleet without it), where it does not (within one configuration; under heavy-tailed slip, unstable steering or guidance that couples passes), and when a zero-miss margin is worth its overlap at all (only when a missed area costs roughly 40–90 times an over-applied one).</w:t>
       </w:r>
     </w:p>
     <w:p>
@@ -220,7 +220,7 @@
         <w:t xml:space="preserve"> </w:t>
       </w:r>
       <w:r>
-        <w:t xml:space="preserve">The work turns a routine decision, how much overlap to plan, into a quantity with a stated reliability, and shows what that reliability costs in agronomic terms. It works with standard guidance hardware and public terrain data, and its limits, including the need for independent ground truth in calibration runs, are stated explicitly.</w:t>
+        <w:t xml:space="preserve">The work turns a routine decision, how much overlap to plan, into a quantity with a stated reliability, and shows what that reliability costs in agronomic terms. It works with standard guidance hardware and public terrain data, and its limits, including the need for an independent reference of the implement position in the logged operations, are stated explicitly.</w:t>
       </w:r>
     </w:p>
     <w:p>

</xml_diff>